<commit_message>
fix: align Day25 completion and containment semantics
</commit_message>
<xml_diff>
--- a/deliverables/NguyenQuangHuy_Day25_onepager.docx
+++ b/deliverables/NguyenQuangHuy_Day25_onepager.docx
@@ -341,7 +341,7 @@
                 <w:color w:val="5B6770"/>
                 <w:sz w:val="13"/>
               </w:rPr>
-              <w:t>CONTAINMENT PROXY</w:t>
+              <w:t>PACKAGE COMPLETION</w:t>
             </w:r>
           </w:p>
         </w:tc>
@@ -386,7 +386,7 @@
                 <w:color w:val="5B6770"/>
                 <w:sz w:val="13"/>
               </w:rPr>
-              <w:t>GM BREAKEVEN</w:t>
+              <w:t>BREAKEVEN PACKAGE RATE</w:t>
             </w:r>
           </w:p>
         </w:tc>
@@ -617,6 +617,31 @@
           </w:p>
           <w:p>
             <w:pPr>
+              <w:spacing w:before="0" w:after="40" w:line="245" w:lineRule="auto"/>
+            </w:pPr>
+            <w:r>
+              <w:rPr>
+                <w:rFonts w:ascii="Calibri" w:hAnsi="Calibri"/>
+                <w:b/>
+                <w:i w:val="0"/>
+                <w:color w:val="183B56"/>
+                <w:sz w:val="14"/>
+              </w:rPr>
+              <w:t xml:space="preserve">Breakeven package-completion rate: </w:t>
+            </w:r>
+            <w:r>
+              <w:rPr>
+                <w:rFonts w:ascii="Calibri" w:hAnsi="Calibri"/>
+                <w:b w:val="0"/>
+                <w:i w:val="0"/>
+                <w:color w:val="1F2937"/>
+                <w:sz w:val="14"/>
+              </w:rPr>
+              <w:t>44.3% at the 60% usage-GM target; current commercial package completion is 80%, for a +35.7 pp package-completion buffer. Autonomous containment is 20% and is not compared with this threshold.</w:t>
+            </w:r>
+          </w:p>
+          <w:p>
+            <w:pPr>
               <w:spacing w:before="0" w:after="60" w:line="245" w:lineRule="auto"/>
             </w:pPr>
             <w:r>
@@ -637,7 +662,7 @@
                 <w:color w:val="1F2937"/>
                 <w:sz w:val="14"/>
               </w:rPr>
-              <w:t>Attribution 2/5: the 5-case local control eval produced 4/5 grounded packages (80%), but no customer time-saved or outcome measurement. Autonomy 1/5: only 1/5 completed without required human intervention; the product routes 4/5 cases to review. Hybrid follows the low-attribution/low-autonomy matrix and avoids unsupported outcome billing.</w:t>
+              <w:t>Attribution 2/5: the 5-case local control eval produced 4/5 grounded packages (80%), but no customer time-saved or outcome measurement. Autonomy 1/5: autonomous containment is 1/5 (20%), while 4/5 cases require human review. Hybrid follows the low-attribution/low-autonomy matrix and avoids unsupported outcome billing.</w:t>
             </w:r>
           </w:p>
           <w:p>
@@ -708,7 +733,7 @@
                       <w:color w:val="7A5A00"/>
                       <w:sz w:val="14"/>
                     </w:rPr>
-                    <w:t>RED TEAM: if the 80% package-completion proxy is wrong by 2x to 40%, usage GM falls to 56.1%. Production completion is the economic gate.</w:t>
+                    <w:t>RED TEAM: if the 80% commercial package-completion rate is wrong by 2x to 40%, usage GM falls to 56.1%. Autonomous containment is 20% and is not compared with the package-completion threshold.</w:t>
                   </w:r>
                 </w:p>
               </w:tc>
@@ -928,7 +953,7 @@
                 <w:b/>
                 <w:i w:val="0"/>
                 <w:color w:val="183B56"/>
-                <w:sz w:val="15"/>
+                <w:sz w:val="14"/>
               </w:rPr>
               <w:t xml:space="preserve">Months 2-3 | Leverage: </w:t>
             </w:r>
@@ -938,9 +963,9 @@
                 <w:b w:val="0"/>
                 <w:i w:val="0"/>
                 <w:color w:val="1F2937"/>
-                <w:sz w:val="15"/>
+                <w:sz w:val="14"/>
               </w:rPr>
-              <w:t>Target 2 pilots / 6,000 jobs / &gt;=85% completion / &gt;=70% GM / CAC &lt;=350M; track 12 qualified opportunities and 3 wins.</w:t>
+              <w:t>Target 2 pilots / 6,000 jobs / &gt;=85% package completion / autonomous containment measured separately / &gt;=70% GM / CAC &lt;=350M; track 12 qualified opportunities and 3 wins.</w:t>
             </w:r>
           </w:p>
           <w:p>
@@ -953,7 +978,7 @@
                 <w:b/>
                 <w:i w:val="0"/>
                 <w:color w:val="183B56"/>
-                <w:sz w:val="15"/>
+                <w:sz w:val="14"/>
               </w:rPr>
               <w:t xml:space="preserve">Month 4+ | Expand: </w:t>
             </w:r>
@@ -963,9 +988,9 @@
                 <w:b w:val="0"/>
                 <w:i w:val="0"/>
                 <w:color w:val="1F2937"/>
-                <w:sz w:val="15"/>
+                <w:sz w:val="14"/>
               </w:rPr>
-              <w:t>Only after &gt;=85% completion, 2 paying customers and security-gap closure. Next niche: multi-merchant payment processors.</w:t>
+              <w:t>Only after &gt;=85% package completion, autonomous containment and 2 paying customers plus security-gap closure. Next niche: multi-merchant payment processors.</w:t>
             </w:r>
           </w:p>
         </w:tc>
@@ -1038,7 +1063,7 @@
                 <w:color w:val="1F2937"/>
                 <w:sz w:val="14"/>
               </w:rPr>
-              <w:t>PARTIAL. Local control eval: 5 attempted, 4 grounded packages (80% commercial completion proxy), 1 autonomous completion (20%), 4 human-review cases and 1 grounding failure; retry telemetry is not instrumented. Eight RAG queries: 100% citation accuracy. Upstream ML recall: 80.08% validation / 84.84% integration. Not customer evidence.</w:t>
+              <w:t>PARTIAL. Small local control eval: 5 attempted, commercial package completion 4/5 (80%), autonomous containment 1/5 (20%), human-review/escalation 4/5 (80%), grounding failures 1/5 (20%); retry telemetry is not instrumented. Eight RAG queries: 100% citation accuracy. Upstream ML recall: 80.08% validation / 84.84% integration. Not customer evidence.</w:t>
             </w:r>
           </w:p>
           <w:p>

</xml_diff>